<commit_message>
Pre-final version of Chapter 8 Orcs completed
</commit_message>
<xml_diff>
--- a/text/part1/08Orcs.docx
+++ b/text/part1/08Orcs.docx
@@ -12,7 +12,19 @@
         <w:rPr>
           <w:lang w:val="ru-RU"/>
         </w:rPr>
-        <w:t>Глава 7. Орки</w:t>
+        <w:t xml:space="preserve">Глава </w:t>
+      </w:r>
+      <w:r>
+        <w:rPr>
+          <w:lang w:val="ru-RU"/>
+        </w:rPr>
+        <w:t>8</w:t>
+      </w:r>
+      <w:r>
+        <w:rPr>
+          <w:lang w:val="ru-RU"/>
+        </w:rPr>
+        <w:t>. Орки</w:t>
       </w:r>
     </w:p>
     <w:p>
@@ -235,7 +247,19 @@
         <w:rPr>
           <w:lang w:val="ru-RU"/>
         </w:rPr>
-        <w:t xml:space="preserve">Я обратил внимание, что, несмотря на огромный прирост в пикинге, СП не дал мне левел-ап. Я по-прежнему оставался агентом третьего класса. </w:t>
+        <w:t xml:space="preserve">Я обратил внимание, что, несмотря на огромный прирост в пикинге, СП не дал мне левел-ап. Я по-прежнему оставался </w:t>
+      </w:r>
+      <w:r>
+        <w:rPr>
+          <w:lang w:val="ru-RU"/>
+        </w:rPr>
+        <w:t>пикером</w:t>
+      </w:r>
+      <w:r>
+        <w:rPr>
+          <w:lang w:val="ru-RU"/>
+        </w:rPr>
+        <w:t xml:space="preserve"> третьего класса. </w:t>
       </w:r>
     </w:p>
     <w:p>
@@ -695,7 +719,19 @@
         <w:rPr>
           <w:lang w:val="ru-RU"/>
         </w:rPr>
-        <w:t xml:space="preserve">начинался в паре десятков метров и </w:t>
+        <w:t xml:space="preserve">начинался в паре десятков </w:t>
+      </w:r>
+      <w:r>
+        <w:rPr>
+          <w:lang w:val="ru-RU"/>
+        </w:rPr>
+        <w:t>шагов</w:t>
+      </w:r>
+      <w:r>
+        <w:rPr>
+          <w:lang w:val="ru-RU"/>
+        </w:rPr>
+        <w:t xml:space="preserve"> и </w:t>
       </w:r>
       <w:r>
         <w:rPr>
@@ -2324,7 +2360,7 @@
         <w:rPr>
           <w:lang w:val="ru-RU"/>
         </w:rPr>
-        <w:t xml:space="preserve">«невестой», развернув её в плашмя </w:t>
+        <w:t xml:space="preserve">«невестой», развернув её плашмя </w:t>
       </w:r>
       <w:r>
         <w:rPr>
@@ -2590,7 +2626,19 @@
         <w:rPr>
           <w:lang w:val="ru-RU"/>
         </w:rPr>
-        <w:t xml:space="preserve"> судорожно пытаясь остановиться.</w:t>
+        <w:t xml:space="preserve"> </w:t>
+      </w:r>
+      <w:r>
+        <w:rPr>
+          <w:lang w:val="ru-RU"/>
+        </w:rPr>
+        <w:t>отчаянно</w:t>
+      </w:r>
+      <w:r>
+        <w:rPr>
+          <w:lang w:val="ru-RU"/>
+        </w:rPr>
+        <w:t xml:space="preserve"> пытаясь остановиться.</w:t>
       </w:r>
     </w:p>
     <w:p>
@@ -3034,19 +3082,43 @@
           <w:lang w:val="ru-RU"/>
         </w:rPr>
         <w:lastRenderedPageBreak/>
-        <w:t xml:space="preserve">Первое, что я увидел, были улепётывающие в сторону близкого леса орки. Первые из них уже </w:t>
-      </w:r>
-      <w:r>
-        <w:rPr>
-          <w:lang w:val="ru-RU"/>
-        </w:rPr>
-        <w:t>приблизились к зарослям</w:t>
-      </w:r>
-      <w:r>
-        <w:rPr>
-          <w:lang w:val="ru-RU"/>
-        </w:rPr>
-        <w:t>. А среди отстающих было несколько всадников, бессильно опустившиеся на спины бережно несущих их животных. Видимо</w:t>
+        <w:t xml:space="preserve">Первое, что я увидел, были улепётывающие в сторону близкого леса </w:t>
+      </w:r>
+      <w:r>
+        <w:rPr>
+          <w:lang w:val="ru-RU"/>
+        </w:rPr>
+        <w:t>хан-волки со своими всадниками на спинах</w:t>
+      </w:r>
+      <w:r>
+        <w:rPr>
+          <w:lang w:val="ru-RU"/>
+        </w:rPr>
+        <w:t xml:space="preserve">. </w:t>
+      </w:r>
+      <w:r>
+        <w:rPr>
+          <w:lang w:val="ru-RU"/>
+        </w:rPr>
+        <w:t xml:space="preserve">Вот только большинство всадников не сидели в сёдлах вертикально, а </w:t>
+      </w:r>
+      <w:r>
+        <w:rPr>
+          <w:lang w:val="ru-RU"/>
+        </w:rPr>
+        <w:t>бессильно опуст</w:t>
+      </w:r>
+      <w:r>
+        <w:rPr>
+          <w:lang w:val="ru-RU"/>
+        </w:rPr>
+        <w:t>ились</w:t>
+      </w:r>
+      <w:r>
+        <w:rPr>
+          <w:lang w:val="ru-RU"/>
+        </w:rPr>
+        <w:t xml:space="preserve"> на спины бережно несущих их животных. Видимо</w:t>
       </w:r>
       <w:r>
         <w:rPr>
@@ -3058,7 +3130,37 @@
         <w:rPr>
           <w:lang w:val="ru-RU"/>
         </w:rPr>
-        <w:t xml:space="preserve"> это были те, в кого я угодил из резонатора, а также тот, кого я оглушил ударом клинка.</w:t>
+        <w:t xml:space="preserve"> это были те, в кого я угодил из резонатора, а также т</w:t>
+      </w:r>
+      <w:r>
+        <w:rPr>
+          <w:lang w:val="ru-RU"/>
+        </w:rPr>
+        <w:t>е</w:t>
+      </w:r>
+      <w:r>
+        <w:rPr>
+          <w:lang w:val="ru-RU"/>
+        </w:rPr>
+        <w:t xml:space="preserve">, </w:t>
+      </w:r>
+      <w:r>
+        <w:rPr>
+          <w:lang w:val="ru-RU"/>
+        </w:rPr>
+        <w:t>кого накрыл крик дракона</w:t>
+      </w:r>
+      <w:r>
+        <w:rPr>
+          <w:lang w:val="ru-RU"/>
+        </w:rPr>
+        <w:t>.</w:t>
+      </w:r>
+      <w:r>
+        <w:rPr>
+          <w:lang w:val="ru-RU"/>
+        </w:rPr>
+        <w:t xml:space="preserve"> Каким-то чудом хан-волки его выдержали, и теперь, по-видимому из последних сил, они спасались сами и спасали своих бесчувственных хозяев.</w:t>
       </w:r>
     </w:p>
     <w:p>
@@ -3305,19 +3407,7 @@
         <w:rPr>
           <w:lang w:val="ru-RU"/>
         </w:rPr>
-        <w:t>Как оказалось, я недооценивал Сану. И м</w:t>
-      </w:r>
-      <w:r>
-        <w:rPr>
-          <w:lang w:val="ru-RU"/>
-        </w:rPr>
-        <w:t xml:space="preserve">ои опасения </w:t>
-      </w:r>
-      <w:r>
-        <w:rPr>
-          <w:lang w:val="ru-RU"/>
-        </w:rPr>
-        <w:t>были напрасными.</w:t>
+        <w:t>Как оказалось, я недооценивал Сану. И мои опасения были напрасными.</w:t>
       </w:r>
     </w:p>
     <w:p>
@@ -3406,43 +3496,7 @@
         <w:rPr>
           <w:lang w:val="ru-RU"/>
         </w:rPr>
-        <w:t>Я понял, что Сана не атаковала раньше,</w:t>
-      </w:r>
-      <w:r>
-        <w:rPr>
-          <w:lang w:val="ru-RU"/>
-        </w:rPr>
-        <w:t xml:space="preserve"> просто потому, что </w:t>
-      </w:r>
-      <w:r>
-        <w:rPr>
-          <w:lang w:val="ru-RU"/>
-        </w:rPr>
-        <w:t>определя</w:t>
-      </w:r>
-      <w:r>
-        <w:rPr>
-          <w:lang w:val="ru-RU"/>
-        </w:rPr>
-        <w:t>ла</w:t>
-      </w:r>
-      <w:r>
-        <w:rPr>
-          <w:lang w:val="ru-RU"/>
-        </w:rPr>
-        <w:t xml:space="preserve"> лидера. </w:t>
-      </w:r>
-      <w:r>
-        <w:rPr>
-          <w:lang w:val="ru-RU"/>
-        </w:rPr>
-        <w:t>Ждала</w:t>
-      </w:r>
-      <w:r>
-        <w:rPr>
-          <w:lang w:val="ru-RU"/>
-        </w:rPr>
-        <w:t>, когда он себя проявит.</w:t>
+        <w:t>Я понял, что Сана не атаковала раньше, просто потому, что определяла лидера. Ждала, когда он себя проявит.</w:t>
       </w:r>
     </w:p>
     <w:p>

</xml_diff>